<commit_message>
Correcting typo in the exercice
</commit_message>
<xml_diff>
--- a/LecturesAndBasicExamples/CobraIntroction/Exercices/Practicals_day_1.docx
+++ b/LecturesAndBasicExamples/CobraIntroction/Exercices/Practicals_day_1.docx
@@ -87,7 +87,7 @@
     </w:p>
     <w:p>
       <w:pPr>
-        <w:pStyle w:val="ListParagraph"/>
+        <w:pStyle w:val="Paragraphedeliste"/>
         <w:numPr>
           <w:ilvl w:val="0"/>
           <w:numId w:val="4"/>
@@ -130,7 +130,6 @@
         </w:rPr>
         <w:t xml:space="preserve"> simple biochemical system directly in COBRA using the </w:t>
       </w:r>
-      <w:proofErr w:type="spellStart"/>
       <w:r>
         <w:rPr>
           <w:rFonts w:ascii="Arial" w:hAnsi="Arial" w:cs="Arial"/>
@@ -140,7 +139,6 @@
         </w:rPr>
         <w:t>createModel</w:t>
       </w:r>
-      <w:proofErr w:type="spellEnd"/>
       <w:r>
         <w:rPr>
           <w:rFonts w:ascii="Arial" w:hAnsi="Arial" w:cs="Arial"/>
@@ -194,7 +192,6 @@
         <w:tc>
           <w:tcPr>
             <w:tcW w:w="1640" w:type="dxa"/>
-            <w:shd w:val="clear" w:color="auto" w:fill="auto"/>
             <w:noWrap/>
             <w:vAlign w:val="center"/>
             <w:hideMark/>
@@ -224,7 +221,6 @@
         <w:tc>
           <w:tcPr>
             <w:tcW w:w="1780" w:type="dxa"/>
-            <w:shd w:val="clear" w:color="auto" w:fill="auto"/>
             <w:noWrap/>
             <w:vAlign w:val="center"/>
             <w:hideMark/>
@@ -254,7 +250,6 @@
         <w:tc>
           <w:tcPr>
             <w:tcW w:w="1280" w:type="dxa"/>
-            <w:shd w:val="clear" w:color="auto" w:fill="auto"/>
             <w:noWrap/>
             <w:vAlign w:val="center"/>
             <w:hideMark/>
@@ -290,7 +285,6 @@
         <w:tc>
           <w:tcPr>
             <w:tcW w:w="1640" w:type="dxa"/>
-            <w:shd w:val="clear" w:color="auto" w:fill="auto"/>
             <w:noWrap/>
             <w:vAlign w:val="center"/>
             <w:hideMark/>
@@ -320,7 +314,6 @@
         <w:tc>
           <w:tcPr>
             <w:tcW w:w="1780" w:type="dxa"/>
-            <w:shd w:val="clear" w:color="auto" w:fill="auto"/>
             <w:noWrap/>
             <w:vAlign w:val="center"/>
             <w:hideMark/>
@@ -348,7 +341,6 @@
         <w:tc>
           <w:tcPr>
             <w:tcW w:w="1280" w:type="dxa"/>
-            <w:shd w:val="clear" w:color="auto" w:fill="auto"/>
             <w:noWrap/>
             <w:vAlign w:val="center"/>
             <w:hideMark/>
@@ -390,7 +382,6 @@
         <w:tc>
           <w:tcPr>
             <w:tcW w:w="1640" w:type="dxa"/>
-            <w:shd w:val="clear" w:color="auto" w:fill="auto"/>
             <w:noWrap/>
             <w:vAlign w:val="center"/>
             <w:hideMark/>
@@ -429,7 +420,6 @@
         <w:tc>
           <w:tcPr>
             <w:tcW w:w="1780" w:type="dxa"/>
-            <w:shd w:val="clear" w:color="auto" w:fill="auto"/>
             <w:noWrap/>
             <w:vAlign w:val="center"/>
             <w:hideMark/>
@@ -473,7 +463,6 @@
         <w:tc>
           <w:tcPr>
             <w:tcW w:w="1280" w:type="dxa"/>
-            <w:shd w:val="clear" w:color="auto" w:fill="auto"/>
             <w:noWrap/>
             <w:vAlign w:val="center"/>
             <w:hideMark/>
@@ -515,7 +504,6 @@
         <w:tc>
           <w:tcPr>
             <w:tcW w:w="1640" w:type="dxa"/>
-            <w:shd w:val="clear" w:color="auto" w:fill="auto"/>
             <w:noWrap/>
             <w:vAlign w:val="center"/>
           </w:tcPr>
@@ -530,7 +518,6 @@
                 <w:lang w:eastAsia="fr-LU"/>
               </w:rPr>
             </w:pPr>
-            <w:proofErr w:type="gramStart"/>
             <w:r>
               <w:rPr>
                 <w:rFonts w:ascii="Arial" w:eastAsia="Times New Roman" w:hAnsi="Arial" w:cs="Arial"/>
@@ -538,24 +525,13 @@
                 <w:color w:val="000000"/>
                 <w:lang w:eastAsia="fr-LU"/>
               </w:rPr>
-              <w:t>v</w:t>
-            </w:r>
-            <w:proofErr w:type="gramEnd"/>
-            <w:r>
-              <w:rPr>
-                <w:rFonts w:ascii="Arial" w:eastAsia="Times New Roman" w:hAnsi="Arial" w:cs="Arial"/>
-                <w:i/>
-                <w:color w:val="000000"/>
-                <w:lang w:eastAsia="fr-LU"/>
-              </w:rPr>
-              <w:t>3</w:t>
+              <w:t>v3</w:t>
             </w:r>
           </w:p>
         </w:tc>
         <w:tc>
           <w:tcPr>
             <w:tcW w:w="1780" w:type="dxa"/>
-            <w:shd w:val="clear" w:color="auto" w:fill="auto"/>
             <w:noWrap/>
             <w:vAlign w:val="center"/>
           </w:tcPr>
@@ -598,7 +574,6 @@
         <w:tc>
           <w:tcPr>
             <w:tcW w:w="1280" w:type="dxa"/>
-            <w:shd w:val="clear" w:color="auto" w:fill="auto"/>
             <w:noWrap/>
             <w:vAlign w:val="center"/>
           </w:tcPr>
@@ -639,7 +614,6 @@
         <w:tc>
           <w:tcPr>
             <w:tcW w:w="1640" w:type="dxa"/>
-            <w:shd w:val="clear" w:color="auto" w:fill="auto"/>
             <w:noWrap/>
             <w:vAlign w:val="center"/>
             <w:hideMark/>
@@ -669,7 +643,6 @@
         <w:tc>
           <w:tcPr>
             <w:tcW w:w="1780" w:type="dxa"/>
-            <w:shd w:val="clear" w:color="auto" w:fill="auto"/>
             <w:noWrap/>
             <w:vAlign w:val="center"/>
             <w:hideMark/>
@@ -713,7 +686,6 @@
         <w:tc>
           <w:tcPr>
             <w:tcW w:w="1280" w:type="dxa"/>
-            <w:shd w:val="clear" w:color="auto" w:fill="auto"/>
             <w:noWrap/>
             <w:vAlign w:val="center"/>
             <w:hideMark/>
@@ -755,7 +727,6 @@
         <w:tc>
           <w:tcPr>
             <w:tcW w:w="1640" w:type="dxa"/>
-            <w:shd w:val="clear" w:color="auto" w:fill="auto"/>
             <w:noWrap/>
             <w:vAlign w:val="center"/>
             <w:hideMark/>
@@ -785,7 +756,6 @@
         <w:tc>
           <w:tcPr>
             <w:tcW w:w="1780" w:type="dxa"/>
-            <w:shd w:val="clear" w:color="auto" w:fill="auto"/>
             <w:noWrap/>
             <w:vAlign w:val="center"/>
           </w:tcPr>
@@ -828,7 +798,6 @@
         <w:tc>
           <w:tcPr>
             <w:tcW w:w="1280" w:type="dxa"/>
-            <w:shd w:val="clear" w:color="auto" w:fill="auto"/>
             <w:noWrap/>
             <w:vAlign w:val="center"/>
           </w:tcPr>
@@ -869,7 +838,6 @@
         <w:tc>
           <w:tcPr>
             <w:tcW w:w="1640" w:type="dxa"/>
-            <w:shd w:val="clear" w:color="auto" w:fill="auto"/>
             <w:noWrap/>
             <w:vAlign w:val="center"/>
           </w:tcPr>
@@ -898,7 +866,6 @@
         <w:tc>
           <w:tcPr>
             <w:tcW w:w="1780" w:type="dxa"/>
-            <w:shd w:val="clear" w:color="auto" w:fill="auto"/>
             <w:noWrap/>
             <w:vAlign w:val="center"/>
           </w:tcPr>
@@ -933,7 +900,6 @@
         <w:tc>
           <w:tcPr>
             <w:tcW w:w="1280" w:type="dxa"/>
-            <w:shd w:val="clear" w:color="auto" w:fill="auto"/>
             <w:noWrap/>
             <w:vAlign w:val="center"/>
           </w:tcPr>
@@ -982,7 +948,7 @@
     </w:p>
     <w:p>
       <w:pPr>
-        <w:pStyle w:val="ListParagraph"/>
+        <w:pStyle w:val="Paragraphedeliste"/>
         <w:numPr>
           <w:ilvl w:val="0"/>
           <w:numId w:val="4"/>
@@ -1138,7 +1104,7 @@
     </w:p>
     <w:p>
       <w:pPr>
-        <w:pStyle w:val="ListParagraph"/>
+        <w:pStyle w:val="Paragraphedeliste"/>
         <w:numPr>
           <w:ilvl w:val="0"/>
           <w:numId w:val="4"/>
@@ -1158,23 +1124,7 @@
           <w:rFonts w:ascii="Arial" w:hAnsi="Arial" w:cs="Arial"/>
           <w:lang w:val="en-US"/>
         </w:rPr>
-        <w:t xml:space="preserve">Perform a </w:t>
-      </w:r>
-      <w:proofErr w:type="gramStart"/>
-      <w:r>
-        <w:rPr>
-          <w:rFonts w:ascii="Arial" w:hAnsi="Arial" w:cs="Arial"/>
-          <w:lang w:val="en-US"/>
-        </w:rPr>
-        <w:t>robustness</w:t>
-      </w:r>
-      <w:proofErr w:type="gramEnd"/>
-      <w:r>
-        <w:rPr>
-          <w:rFonts w:ascii="Arial" w:hAnsi="Arial" w:cs="Arial"/>
-          <w:lang w:val="en-US"/>
-        </w:rPr>
-        <w:t xml:space="preserve"> analysis for </w:t>
+        <w:t xml:space="preserve">Perform a robustness analysis for </w:t>
       </w:r>
       <w:r>
         <w:rPr>
@@ -1297,7 +1247,7 @@
     </w:p>
     <w:p>
       <w:pPr>
-        <w:pStyle w:val="ListParagraph"/>
+        <w:pStyle w:val="Paragraphedeliste"/>
         <w:numPr>
           <w:ilvl w:val="0"/>
           <w:numId w:val="4"/>
@@ -1602,7 +1552,7 @@
     </w:p>
     <w:p>
       <w:pPr>
-        <w:pStyle w:val="ListParagraph"/>
+        <w:pStyle w:val="Paragraphedeliste"/>
         <w:numPr>
           <w:ilvl w:val="0"/>
           <w:numId w:val="4"/>
@@ -1713,7 +1663,7 @@
     </w:p>
     <w:p>
       <w:pPr>
-        <w:pStyle w:val="ListParagraph"/>
+        <w:pStyle w:val="Paragraphedeliste"/>
         <w:spacing w:line="360" w:lineRule="auto"/>
         <w:ind w:left="360"/>
         <w:jc w:val="both"/>
@@ -1729,25 +1679,7 @@
           <w:b/>
           <w:lang w:val="en-US"/>
         </w:rPr>
-        <w:t xml:space="preserve">model = </w:t>
-      </w:r>
-      <w:proofErr w:type="spellStart"/>
-      <w:r>
-        <w:rPr>
-          <w:rFonts w:ascii="Arial" w:hAnsi="Arial" w:cs="Arial"/>
-          <w:b/>
-          <w:lang w:val="en-US"/>
-        </w:rPr>
-        <w:t>changeRxnBounds</w:t>
-      </w:r>
-      <w:proofErr w:type="spellEnd"/>
-      <w:r>
-        <w:rPr>
-          <w:rFonts w:ascii="Arial" w:hAnsi="Arial" w:cs="Arial"/>
-          <w:b/>
-          <w:lang w:val="en-US"/>
-        </w:rPr>
-        <w:t>(model,'v</w:t>
+        <w:t>model = changeRxnBounds(model,'v</w:t>
       </w:r>
       <w:r>
         <w:rPr>
@@ -1763,16 +1695,7 @@
           <w:b/>
           <w:lang w:val="en-US"/>
         </w:rPr>
-        <w:t>',0.9*</w:t>
-      </w:r>
-      <w:proofErr w:type="spellStart"/>
-      <w:r>
-        <w:rPr>
-          <w:rFonts w:ascii="Arial" w:hAnsi="Arial" w:cs="Arial"/>
-          <w:b/>
-          <w:lang w:val="en-US"/>
-        </w:rPr>
-        <w:t>FBAsolution.f,'</w:t>
+        <w:t>',0.9*FBAsolution.f,'</w:t>
       </w:r>
       <w:r>
         <w:rPr>
@@ -1782,29 +1705,18 @@
         </w:rPr>
         <w:t>l</w:t>
       </w:r>
-      <w:proofErr w:type="spellEnd"/>
-      <w:r>
-        <w:rPr>
-          <w:rFonts w:ascii="Arial" w:hAnsi="Arial" w:cs="Arial"/>
-          <w:b/>
-          <w:lang w:val="en-US"/>
-        </w:rPr>
-        <w:t>'</w:t>
-      </w:r>
-      <w:proofErr w:type="gramStart"/>
-      <w:r>
-        <w:rPr>
-          <w:rFonts w:ascii="Arial" w:hAnsi="Arial" w:cs="Arial"/>
-          <w:b/>
-          <w:lang w:val="en-US"/>
-        </w:rPr>
-        <w:t>);</w:t>
-      </w:r>
-      <w:proofErr w:type="gramEnd"/>
+      <w:r>
+        <w:rPr>
+          <w:rFonts w:ascii="Arial" w:hAnsi="Arial" w:cs="Arial"/>
+          <w:b/>
+          <w:lang w:val="en-US"/>
+        </w:rPr>
+        <w:t>');</w:t>
+      </w:r>
     </w:p>
     <w:p>
       <w:pPr>
-        <w:pStyle w:val="ListParagraph"/>
+        <w:pStyle w:val="Paragraphedeliste"/>
         <w:numPr>
           <w:ilvl w:val="0"/>
           <w:numId w:val="4"/>
@@ -1852,7 +1764,7 @@
     </w:p>
     <w:p>
       <w:pPr>
-        <w:pStyle w:val="ListParagraph"/>
+        <w:pStyle w:val="Paragraphedeliste"/>
         <w:numPr>
           <w:ilvl w:val="0"/>
           <w:numId w:val="4"/>
@@ -1872,7 +1784,35 @@
           <w:rFonts w:ascii="Arial" w:hAnsi="Arial" w:cs="Arial"/>
           <w:lang w:val="en-US"/>
         </w:rPr>
-        <w:t>Perform a double gene deletion study. What is the only non-lethal double deletion?</w:t>
+        <w:t xml:space="preserve">Perform a double gene deletion study. What </w:t>
+      </w:r>
+      <w:r>
+        <w:rPr>
+          <w:rFonts w:ascii="Arial" w:hAnsi="Arial" w:cs="Arial"/>
+          <w:lang w:val="en-US"/>
+        </w:rPr>
+        <w:t>are</w:t>
+      </w:r>
+      <w:r>
+        <w:rPr>
+          <w:rFonts w:ascii="Arial" w:hAnsi="Arial" w:cs="Arial"/>
+          <w:lang w:val="en-US"/>
+        </w:rPr>
+        <w:t xml:space="preserve"> the non-lethal double deletion</w:t>
+      </w:r>
+      <w:r>
+        <w:rPr>
+          <w:rFonts w:ascii="Arial" w:hAnsi="Arial" w:cs="Arial"/>
+          <w:lang w:val="en-US"/>
+        </w:rPr>
+        <w:t>s</w:t>
+      </w:r>
+      <w:r>
+        <w:rPr>
+          <w:rFonts w:ascii="Arial" w:hAnsi="Arial" w:cs="Arial"/>
+          <w:lang w:val="en-US"/>
+        </w:rPr>
+        <w:t>?</w:t>
       </w:r>
     </w:p>
     <w:p>
@@ -1932,7 +1872,7 @@
     </w:p>
     <w:p>
       <w:pPr>
-        <w:pStyle w:val="ListParagraph"/>
+        <w:pStyle w:val="Paragraphedeliste"/>
         <w:autoSpaceDE w:val="0"/>
         <w:autoSpaceDN w:val="0"/>
         <w:adjustRightInd w:val="0"/>
@@ -1999,7 +1939,7 @@
     </w:p>
     <w:p>
       <w:pPr>
-        <w:pStyle w:val="ListParagraph"/>
+        <w:pStyle w:val="Paragraphedeliste"/>
         <w:numPr>
           <w:ilvl w:val="0"/>
           <w:numId w:val="5"/>
@@ -2091,7 +2031,7 @@
     </w:p>
     <w:p>
       <w:pPr>
-        <w:pStyle w:val="ListParagraph"/>
+        <w:pStyle w:val="Paragraphedeliste"/>
         <w:autoSpaceDE w:val="0"/>
         <w:autoSpaceDN w:val="0"/>
         <w:adjustRightInd w:val="0"/>
@@ -2161,7 +2101,6 @@
               <w:bottom w:val="nil"/>
               <w:right w:val="nil"/>
             </w:tcBorders>
-            <w:shd w:val="clear" w:color="auto" w:fill="auto"/>
             <w:noWrap/>
             <w:vAlign w:val="center"/>
             <w:hideMark/>
@@ -2197,7 +2136,6 @@
               <w:bottom w:val="nil"/>
               <w:right w:val="nil"/>
             </w:tcBorders>
-            <w:shd w:val="clear" w:color="auto" w:fill="auto"/>
             <w:noWrap/>
             <w:vAlign w:val="center"/>
             <w:hideMark/>
@@ -2233,7 +2171,6 @@
               <w:bottom w:val="nil"/>
               <w:right w:val="nil"/>
             </w:tcBorders>
-            <w:shd w:val="clear" w:color="auto" w:fill="auto"/>
             <w:noWrap/>
             <w:vAlign w:val="center"/>
             <w:hideMark/>
@@ -2275,7 +2212,6 @@
               <w:bottom w:val="nil"/>
               <w:right w:val="nil"/>
             </w:tcBorders>
-            <w:shd w:val="clear" w:color="auto" w:fill="auto"/>
             <w:noWrap/>
             <w:vAlign w:val="center"/>
             <w:hideMark/>
@@ -2290,7 +2226,6 @@
                 <w:lang w:eastAsia="fr-LU"/>
               </w:rPr>
             </w:pPr>
-            <w:proofErr w:type="gramStart"/>
             <w:r>
               <w:rPr>
                 <w:rFonts w:ascii="Arial" w:eastAsia="Times New Roman" w:hAnsi="Arial" w:cs="Arial"/>
@@ -2299,7 +2234,6 @@
               </w:rPr>
               <w:t>mu</w:t>
             </w:r>
-            <w:proofErr w:type="gramEnd"/>
           </w:p>
         </w:tc>
         <w:tc>
@@ -2311,7 +2245,6 @@
               <w:bottom w:val="nil"/>
               <w:right w:val="nil"/>
             </w:tcBorders>
-            <w:shd w:val="clear" w:color="auto" w:fill="auto"/>
             <w:noWrap/>
             <w:vAlign w:val="center"/>
             <w:hideMark/>
@@ -2361,7 +2294,6 @@
               <w:bottom w:val="nil"/>
               <w:right w:val="nil"/>
             </w:tcBorders>
-            <w:shd w:val="clear" w:color="auto" w:fill="auto"/>
             <w:noWrap/>
             <w:vAlign w:val="center"/>
             <w:hideMark/>
@@ -2376,7 +2308,6 @@
                 <w:lang w:eastAsia="fr-LU"/>
               </w:rPr>
             </w:pPr>
-            <w:proofErr w:type="spellStart"/>
             <w:r>
               <w:rPr>
                 <w:rFonts w:ascii="Arial" w:eastAsia="Times New Roman" w:hAnsi="Arial" w:cs="Arial"/>
@@ -2393,7 +2324,6 @@
               </w:rPr>
               <w:t>MU</w:t>
             </w:r>
-            <w:proofErr w:type="spellEnd"/>
           </w:p>
         </w:tc>
       </w:tr>
@@ -2411,7 +2341,6 @@
               <w:bottom w:val="nil"/>
               <w:right w:val="nil"/>
             </w:tcBorders>
-            <w:shd w:val="clear" w:color="auto" w:fill="auto"/>
             <w:noWrap/>
             <w:vAlign w:val="center"/>
             <w:hideMark/>
@@ -2445,7 +2374,6 @@
               <w:bottom w:val="nil"/>
               <w:right w:val="nil"/>
             </w:tcBorders>
-            <w:shd w:val="clear" w:color="auto" w:fill="auto"/>
             <w:noWrap/>
             <w:vAlign w:val="center"/>
             <w:hideMark/>
@@ -2495,7 +2423,6 @@
               <w:bottom w:val="nil"/>
               <w:right w:val="nil"/>
             </w:tcBorders>
-            <w:shd w:val="clear" w:color="auto" w:fill="auto"/>
             <w:noWrap/>
             <w:vAlign w:val="center"/>
             <w:hideMark/>
@@ -2535,7 +2462,6 @@
               <w:bottom w:val="nil"/>
               <w:right w:val="nil"/>
             </w:tcBorders>
-            <w:shd w:val="clear" w:color="auto" w:fill="auto"/>
             <w:noWrap/>
             <w:vAlign w:val="center"/>
             <w:hideMark/>
@@ -2569,7 +2495,6 @@
               <w:bottom w:val="nil"/>
               <w:right w:val="nil"/>
             </w:tcBorders>
-            <w:shd w:val="clear" w:color="auto" w:fill="auto"/>
             <w:noWrap/>
             <w:vAlign w:val="center"/>
             <w:hideMark/>
@@ -2619,7 +2544,6 @@
               <w:bottom w:val="nil"/>
               <w:right w:val="nil"/>
             </w:tcBorders>
-            <w:shd w:val="clear" w:color="auto" w:fill="auto"/>
             <w:noWrap/>
             <w:vAlign w:val="center"/>
             <w:hideMark/>
@@ -2659,7 +2583,6 @@
               <w:bottom w:val="nil"/>
               <w:right w:val="nil"/>
             </w:tcBorders>
-            <w:shd w:val="clear" w:color="auto" w:fill="auto"/>
             <w:noWrap/>
             <w:vAlign w:val="center"/>
             <w:hideMark/>
@@ -2693,7 +2616,6 @@
               <w:bottom w:val="nil"/>
               <w:right w:val="nil"/>
             </w:tcBorders>
-            <w:shd w:val="clear" w:color="auto" w:fill="auto"/>
             <w:noWrap/>
             <w:vAlign w:val="center"/>
             <w:hideMark/>
@@ -2743,7 +2665,6 @@
               <w:bottom w:val="nil"/>
               <w:right w:val="nil"/>
             </w:tcBorders>
-            <w:shd w:val="clear" w:color="auto" w:fill="auto"/>
             <w:noWrap/>
             <w:vAlign w:val="center"/>
             <w:hideMark/>
@@ -2791,7 +2712,6 @@
               <w:bottom w:val="nil"/>
               <w:right w:val="nil"/>
             </w:tcBorders>
-            <w:shd w:val="clear" w:color="auto" w:fill="auto"/>
             <w:noWrap/>
             <w:vAlign w:val="center"/>
             <w:hideMark/>
@@ -2825,7 +2745,6 @@
               <w:bottom w:val="nil"/>
               <w:right w:val="nil"/>
             </w:tcBorders>
-            <w:shd w:val="clear" w:color="auto" w:fill="auto"/>
             <w:noWrap/>
             <w:vAlign w:val="center"/>
             <w:hideMark/>
@@ -2875,7 +2794,6 @@
               <w:bottom w:val="nil"/>
               <w:right w:val="nil"/>
             </w:tcBorders>
-            <w:shd w:val="clear" w:color="auto" w:fill="auto"/>
             <w:noWrap/>
             <w:vAlign w:val="center"/>
             <w:hideMark/>
@@ -2923,7 +2841,6 @@
               <w:bottom w:val="nil"/>
               <w:right w:val="nil"/>
             </w:tcBorders>
-            <w:shd w:val="clear" w:color="auto" w:fill="auto"/>
             <w:noWrap/>
             <w:vAlign w:val="center"/>
             <w:hideMark/>
@@ -2957,7 +2874,6 @@
               <w:bottom w:val="nil"/>
               <w:right w:val="nil"/>
             </w:tcBorders>
-            <w:shd w:val="clear" w:color="auto" w:fill="auto"/>
             <w:noWrap/>
             <w:vAlign w:val="center"/>
             <w:hideMark/>
@@ -3007,7 +2923,6 @@
               <w:bottom w:val="nil"/>
               <w:right w:val="nil"/>
             </w:tcBorders>
-            <w:shd w:val="clear" w:color="auto" w:fill="auto"/>
             <w:noWrap/>
             <w:vAlign w:val="center"/>
             <w:hideMark/>
@@ -3055,7 +2970,6 @@
               <w:bottom w:val="nil"/>
               <w:right w:val="nil"/>
             </w:tcBorders>
-            <w:shd w:val="clear" w:color="auto" w:fill="auto"/>
             <w:noWrap/>
             <w:vAlign w:val="center"/>
             <w:hideMark/>
@@ -3089,7 +3003,6 @@
               <w:bottom w:val="nil"/>
               <w:right w:val="nil"/>
             </w:tcBorders>
-            <w:shd w:val="clear" w:color="auto" w:fill="auto"/>
             <w:noWrap/>
             <w:vAlign w:val="center"/>
             <w:hideMark/>
@@ -3139,7 +3052,6 @@
               <w:bottom w:val="nil"/>
               <w:right w:val="nil"/>
             </w:tcBorders>
-            <w:shd w:val="clear" w:color="auto" w:fill="auto"/>
             <w:noWrap/>
             <w:vAlign w:val="center"/>
             <w:hideMark/>
@@ -3187,7 +3099,6 @@
               <w:bottom w:val="nil"/>
               <w:right w:val="nil"/>
             </w:tcBorders>
-            <w:shd w:val="clear" w:color="auto" w:fill="auto"/>
             <w:noWrap/>
             <w:vAlign w:val="center"/>
             <w:hideMark/>
@@ -3221,7 +3132,6 @@
               <w:bottom w:val="nil"/>
               <w:right w:val="nil"/>
             </w:tcBorders>
-            <w:shd w:val="clear" w:color="auto" w:fill="auto"/>
             <w:noWrap/>
             <w:vAlign w:val="center"/>
             <w:hideMark/>
@@ -3271,7 +3181,6 @@
               <w:bottom w:val="nil"/>
               <w:right w:val="nil"/>
             </w:tcBorders>
-            <w:shd w:val="clear" w:color="auto" w:fill="auto"/>
             <w:noWrap/>
             <w:vAlign w:val="center"/>
             <w:hideMark/>
@@ -3319,7 +3228,6 @@
               <w:bottom w:val="nil"/>
               <w:right w:val="nil"/>
             </w:tcBorders>
-            <w:shd w:val="clear" w:color="auto" w:fill="auto"/>
             <w:noWrap/>
             <w:vAlign w:val="center"/>
             <w:hideMark/>
@@ -3353,7 +3261,6 @@
               <w:bottom w:val="nil"/>
               <w:right w:val="nil"/>
             </w:tcBorders>
-            <w:shd w:val="clear" w:color="auto" w:fill="auto"/>
             <w:noWrap/>
             <w:vAlign w:val="center"/>
             <w:hideMark/>
@@ -3403,7 +3310,6 @@
               <w:bottom w:val="nil"/>
               <w:right w:val="nil"/>
             </w:tcBorders>
-            <w:shd w:val="clear" w:color="auto" w:fill="auto"/>
             <w:noWrap/>
             <w:vAlign w:val="center"/>
             <w:hideMark/>
@@ -3451,7 +3357,6 @@
               <w:bottom w:val="nil"/>
               <w:right w:val="nil"/>
             </w:tcBorders>
-            <w:shd w:val="clear" w:color="auto" w:fill="auto"/>
             <w:noWrap/>
             <w:vAlign w:val="center"/>
             <w:hideMark/>
@@ -3485,7 +3390,6 @@
               <w:bottom w:val="nil"/>
               <w:right w:val="nil"/>
             </w:tcBorders>
-            <w:shd w:val="clear" w:color="auto" w:fill="auto"/>
             <w:noWrap/>
             <w:vAlign w:val="center"/>
             <w:hideMark/>
@@ -3527,7 +3431,6 @@
               <w:bottom w:val="nil"/>
               <w:right w:val="nil"/>
             </w:tcBorders>
-            <w:shd w:val="clear" w:color="auto" w:fill="auto"/>
             <w:noWrap/>
             <w:vAlign w:val="center"/>
             <w:hideMark/>
@@ -3564,7 +3467,7 @@
     </w:tbl>
     <w:p>
       <w:pPr>
-        <w:pStyle w:val="ListParagraph"/>
+        <w:pStyle w:val="Paragraphedeliste"/>
         <w:autoSpaceDE w:val="0"/>
         <w:autoSpaceDN w:val="0"/>
         <w:adjustRightInd w:val="0"/>
@@ -3588,7 +3491,7 @@
     </w:p>
     <w:p>
       <w:pPr>
-        <w:pStyle w:val="ListParagraph"/>
+        <w:pStyle w:val="Paragraphedeliste"/>
         <w:numPr>
           <w:ilvl w:val="0"/>
           <w:numId w:val="5"/>
@@ -3680,7 +3583,7 @@
     </w:p>
     <w:p>
       <w:pPr>
-        <w:pStyle w:val="ListParagraph"/>
+        <w:pStyle w:val="Paragraphedeliste"/>
         <w:numPr>
           <w:ilvl w:val="0"/>
           <w:numId w:val="5"/>
@@ -3775,7 +3678,7 @@
     </w:p>
     <w:p>
       <w:pPr>
-        <w:pStyle w:val="ListParagraph"/>
+        <w:pStyle w:val="Paragraphedeliste"/>
         <w:numPr>
           <w:ilvl w:val="0"/>
           <w:numId w:val="5"/>
@@ -3936,7 +3839,7 @@
     </w:p>
     <w:p>
       <w:pPr>
-        <w:pStyle w:val="ListParagraph"/>
+        <w:pStyle w:val="Paragraphedeliste"/>
         <w:autoSpaceDE w:val="0"/>
         <w:autoSpaceDN w:val="0"/>
         <w:adjustRightInd w:val="0"/>
@@ -3976,36 +3879,8 @@
           <w:b/>
           <w:lang w:val="en-US"/>
         </w:rPr>
-        <w:t xml:space="preserve">sol = </w:t>
-      </w:r>
-      <w:proofErr w:type="spellStart"/>
-      <w:r>
-        <w:rPr>
-          <w:rFonts w:ascii="Arial" w:hAnsi="Arial" w:cs="Arial"/>
-          <w:b/>
-          <w:lang w:val="en-US"/>
-        </w:rPr>
-        <w:t>optimizeCbModel</w:t>
-      </w:r>
-      <w:proofErr w:type="spellEnd"/>
-      <w:r>
-        <w:rPr>
-          <w:rFonts w:ascii="Arial" w:hAnsi="Arial" w:cs="Arial"/>
-          <w:b/>
-          <w:lang w:val="en-US"/>
-        </w:rPr>
-        <w:t>(model</w:t>
-      </w:r>
-      <w:proofErr w:type="gramStart"/>
-      <w:r>
-        <w:rPr>
-          <w:rFonts w:ascii="Arial" w:hAnsi="Arial" w:cs="Arial"/>
-          <w:b/>
-          <w:lang w:val="en-US"/>
-        </w:rPr>
-        <w:t>);</w:t>
-      </w:r>
-      <w:proofErr w:type="gramEnd"/>
+        <w:t>sol = optimizeCbModel(model);</w:t>
+      </w:r>
     </w:p>
     <w:p>
       <w:pPr>
@@ -4021,43 +3896,13 @@
           <w:lang w:val="en-US"/>
         </w:rPr>
       </w:pPr>
-      <w:proofErr w:type="spellStart"/>
-      <w:r>
-        <w:rPr>
-          <w:rFonts w:ascii="Arial" w:hAnsi="Arial" w:cs="Arial"/>
-          <w:b/>
-          <w:lang w:val="en-US"/>
-        </w:rPr>
-        <w:t>growthRate</w:t>
-      </w:r>
-      <w:proofErr w:type="spellEnd"/>
-      <w:r>
-        <w:rPr>
-          <w:rFonts w:ascii="Arial" w:hAnsi="Arial" w:cs="Arial"/>
-          <w:b/>
-          <w:lang w:val="en-US"/>
-        </w:rPr>
-        <w:t xml:space="preserve"> = </w:t>
-      </w:r>
-      <w:proofErr w:type="spellStart"/>
-      <w:proofErr w:type="gramStart"/>
-      <w:r>
-        <w:rPr>
-          <w:rFonts w:ascii="Arial" w:hAnsi="Arial" w:cs="Arial"/>
-          <w:b/>
-          <w:lang w:val="en-US"/>
-        </w:rPr>
-        <w:t>sol.f</w:t>
-      </w:r>
-      <w:proofErr w:type="spellEnd"/>
-      <w:proofErr w:type="gramEnd"/>
-      <w:r>
-        <w:rPr>
-          <w:rFonts w:ascii="Arial" w:hAnsi="Arial" w:cs="Arial"/>
-          <w:b/>
-          <w:lang w:val="en-US"/>
-        </w:rPr>
-        <w:t>;</w:t>
+      <w:r>
+        <w:rPr>
+          <w:rFonts w:ascii="Arial" w:hAnsi="Arial" w:cs="Arial"/>
+          <w:b/>
+          <w:lang w:val="en-US"/>
+        </w:rPr>
+        <w:t>growthRate = sol.f;</w:t>
       </w:r>
     </w:p>
     <w:p>
@@ -4088,66 +3933,20 @@
           <w:b/>
           <w:lang w:val="en-US"/>
         </w:rPr>
-        <w:t xml:space="preserve">del = </w:t>
-      </w:r>
-      <w:proofErr w:type="spellStart"/>
-      <w:r>
-        <w:rPr>
-          <w:rFonts w:ascii="Arial" w:hAnsi="Arial" w:cs="Arial"/>
-          <w:b/>
-          <w:lang w:val="en-US"/>
-        </w:rPr>
-        <w:t>changeRxnBounds</w:t>
-      </w:r>
-      <w:proofErr w:type="spellEnd"/>
-      <w:r>
-        <w:rPr>
-          <w:rFonts w:ascii="Arial" w:hAnsi="Arial" w:cs="Arial"/>
-          <w:b/>
-          <w:lang w:val="en-US"/>
-        </w:rPr>
-        <w:t>(model,'mu</w:t>
-      </w:r>
-      <w:r>
-        <w:rPr>
-          <w:rFonts w:ascii="Arial" w:hAnsi="Arial" w:cs="Arial"/>
-          <w:b/>
-          <w:lang w:val="en-US"/>
-        </w:rPr>
-        <w:t>',0.9*</w:t>
-      </w:r>
-      <w:proofErr w:type="spellStart"/>
-      <w:r>
-        <w:rPr>
-          <w:rFonts w:ascii="Arial" w:hAnsi="Arial" w:cs="Arial"/>
-          <w:b/>
-          <w:lang w:val="en-US"/>
-        </w:rPr>
-        <w:t>growthRate</w:t>
-      </w:r>
-      <w:proofErr w:type="spellEnd"/>
-      <w:r>
-        <w:rPr>
-          <w:rFonts w:ascii="Arial" w:hAnsi="Arial" w:cs="Arial"/>
-          <w:b/>
-          <w:lang w:val="en-US"/>
-        </w:rPr>
-        <w:t>,'l'</w:t>
-      </w:r>
-      <w:proofErr w:type="gramStart"/>
-      <w:r>
-        <w:rPr>
-          <w:rFonts w:ascii="Arial" w:hAnsi="Arial" w:cs="Arial"/>
-          <w:b/>
-          <w:lang w:val="en-US"/>
-        </w:rPr>
-        <w:t>);</w:t>
-      </w:r>
-      <w:proofErr w:type="gramEnd"/>
+        <w:t>del = changeRxnBounds(model,'mu</w:t>
+      </w:r>
+      <w:r>
+        <w:rPr>
+          <w:rFonts w:ascii="Arial" w:hAnsi="Arial" w:cs="Arial"/>
+          <w:b/>
+          <w:lang w:val="en-US"/>
+        </w:rPr>
+        <w:t>',0.9*growthRate,'l');</w:t>
+      </w:r>
     </w:p>
     <w:p>
       <w:pPr>
-        <w:pStyle w:val="ListParagraph"/>
+        <w:pStyle w:val="Paragraphedeliste"/>
         <w:numPr>
           <w:ilvl w:val="0"/>
           <w:numId w:val="5"/>
@@ -4344,7 +4143,6 @@
           <w:lang w:val="en-US"/>
         </w:rPr>
       </w:pPr>
-      <w:proofErr w:type="gramStart"/>
       <w:r>
         <w:rPr>
           <w:rFonts w:ascii="Arial" w:hAnsi="Arial" w:cs="Arial"/>
@@ -4354,7 +4152,6 @@
         </w:rPr>
         <w:t>figure;</w:t>
       </w:r>
-      <w:proofErr w:type="gramEnd"/>
     </w:p>
     <w:p>
       <w:pPr>
@@ -4377,87 +4174,7 @@
           <w:szCs w:val="24"/>
           <w:lang w:val="en-US"/>
         </w:rPr>
-        <w:t xml:space="preserve">for </w:t>
-      </w:r>
-      <w:proofErr w:type="spellStart"/>
-      <w:r>
-        <w:rPr>
-          <w:rFonts w:ascii="Arial" w:hAnsi="Arial" w:cs="Arial"/>
-          <w:b/>
-          <w:szCs w:val="24"/>
-          <w:lang w:val="en-US"/>
-        </w:rPr>
-        <w:t>i</w:t>
-      </w:r>
-      <w:proofErr w:type="spellEnd"/>
-      <w:r>
-        <w:rPr>
-          <w:rFonts w:ascii="Arial" w:hAnsi="Arial" w:cs="Arial"/>
-          <w:b/>
-          <w:szCs w:val="24"/>
-          <w:lang w:val="en-US"/>
-        </w:rPr>
-        <w:t xml:space="preserve"> = </w:t>
-      </w:r>
-      <w:proofErr w:type="gramStart"/>
-      <w:r>
-        <w:rPr>
-          <w:rFonts w:ascii="Arial" w:hAnsi="Arial" w:cs="Arial"/>
-          <w:b/>
-          <w:szCs w:val="24"/>
-          <w:lang w:val="en-US"/>
-        </w:rPr>
-        <w:t>1 :</w:t>
-      </w:r>
-      <w:proofErr w:type="gramEnd"/>
-      <w:r>
-        <w:rPr>
-          <w:rFonts w:ascii="Arial" w:hAnsi="Arial" w:cs="Arial"/>
-          <w:b/>
-          <w:szCs w:val="24"/>
-          <w:lang w:val="en-US"/>
-        </w:rPr>
-        <w:t xml:space="preserve"> </w:t>
-      </w:r>
-      <w:proofErr w:type="spellStart"/>
-      <w:r>
-        <w:rPr>
-          <w:rFonts w:ascii="Arial" w:hAnsi="Arial" w:cs="Arial"/>
-          <w:b/>
-          <w:szCs w:val="24"/>
-          <w:lang w:val="en-US"/>
-        </w:rPr>
-        <w:t>numel</w:t>
-      </w:r>
-      <w:proofErr w:type="spellEnd"/>
-      <w:r>
-        <w:rPr>
-          <w:rFonts w:ascii="Arial" w:hAnsi="Arial" w:cs="Arial"/>
-          <w:b/>
-          <w:szCs w:val="24"/>
-          <w:lang w:val="en-US"/>
-        </w:rPr>
-        <w:t>(</w:t>
-      </w:r>
-      <w:proofErr w:type="spellStart"/>
-      <w:r>
-        <w:rPr>
-          <w:rFonts w:ascii="Arial" w:hAnsi="Arial" w:cs="Arial"/>
-          <w:b/>
-          <w:szCs w:val="24"/>
-          <w:lang w:val="en-US"/>
-        </w:rPr>
-        <w:t>rxns</w:t>
-      </w:r>
-      <w:proofErr w:type="spellEnd"/>
-      <w:r>
-        <w:rPr>
-          <w:rFonts w:ascii="Arial" w:hAnsi="Arial" w:cs="Arial"/>
-          <w:b/>
-          <w:szCs w:val="24"/>
-          <w:lang w:val="en-US"/>
-        </w:rPr>
-        <w:t>)</w:t>
+        <w:t>for i = 1 : numel(rxns)</w:t>
       </w:r>
     </w:p>
     <w:p>
@@ -4499,27 +4216,7 @@
           <w:szCs w:val="24"/>
           <w:lang w:val="en-US"/>
         </w:rPr>
-        <w:t>subplot(2,</w:t>
-      </w:r>
-      <w:proofErr w:type="gramStart"/>
-      <w:r>
-        <w:rPr>
-          <w:rFonts w:ascii="Arial" w:hAnsi="Arial" w:cs="Arial"/>
-          <w:b/>
-          <w:szCs w:val="24"/>
-          <w:lang w:val="en-US"/>
-        </w:rPr>
-        <w:t>3,i</w:t>
-      </w:r>
-      <w:proofErr w:type="gramEnd"/>
-      <w:r>
-        <w:rPr>
-          <w:rFonts w:ascii="Arial" w:hAnsi="Arial" w:cs="Arial"/>
-          <w:b/>
-          <w:szCs w:val="24"/>
-          <w:lang w:val="en-US"/>
-        </w:rPr>
-        <w:t>)</w:t>
+        <w:t>subplot(2,3,i)</w:t>
       </w:r>
     </w:p>
     <w:p>
@@ -4553,90 +4250,17 @@
           <w:lang w:val="en-US"/>
         </w:rPr>
         <w:tab/>
-        <w:t>pos=find(</w:t>
-      </w:r>
-      <w:proofErr w:type="spellStart"/>
-      <w:proofErr w:type="gramStart"/>
-      <w:r>
-        <w:rPr>
-          <w:rFonts w:ascii="Arial" w:hAnsi="Arial" w:cs="Arial"/>
-          <w:b/>
-          <w:szCs w:val="24"/>
-          <w:lang w:val="en-US"/>
-        </w:rPr>
-        <w:t>ismember</w:t>
-      </w:r>
-      <w:proofErr w:type="spellEnd"/>
-      <w:r>
-        <w:rPr>
-          <w:rFonts w:ascii="Arial" w:hAnsi="Arial" w:cs="Arial"/>
-          <w:b/>
-          <w:szCs w:val="24"/>
-          <w:lang w:val="en-US"/>
-        </w:rPr>
-        <w:t>(</w:t>
-      </w:r>
-      <w:proofErr w:type="spellStart"/>
-      <w:r>
-        <w:rPr>
-          <w:rFonts w:ascii="Arial" w:hAnsi="Arial" w:cs="Arial"/>
-          <w:b/>
-          <w:szCs w:val="24"/>
-          <w:lang w:val="en-US"/>
-        </w:rPr>
-        <w:t>modelSampling</w:t>
-      </w:r>
-      <w:r>
-        <w:rPr>
-          <w:rFonts w:ascii="Arial" w:hAnsi="Arial" w:cs="Arial"/>
-          <w:b/>
-          <w:szCs w:val="24"/>
-          <w:lang w:val="en-US"/>
-        </w:rPr>
-        <w:t>.rxns,rxns</w:t>
-      </w:r>
-      <w:proofErr w:type="spellEnd"/>
-      <w:proofErr w:type="gramEnd"/>
-      <w:r>
-        <w:rPr>
-          <w:rFonts w:ascii="Arial" w:hAnsi="Arial" w:cs="Arial"/>
-          <w:b/>
-          <w:szCs w:val="24"/>
-          <w:lang w:val="en-US"/>
-        </w:rPr>
-        <w:t>(</w:t>
-      </w:r>
-      <w:proofErr w:type="spellStart"/>
-      <w:r>
-        <w:rPr>
-          <w:rFonts w:ascii="Arial" w:hAnsi="Arial" w:cs="Arial"/>
-          <w:b/>
-          <w:szCs w:val="24"/>
-          <w:lang w:val="en-US"/>
-        </w:rPr>
-        <w:t>i</w:t>
-      </w:r>
-      <w:proofErr w:type="spellEnd"/>
-      <w:r>
-        <w:rPr>
-          <w:rFonts w:ascii="Arial" w:hAnsi="Arial" w:cs="Arial"/>
-          <w:b/>
-          <w:szCs w:val="24"/>
-          <w:lang w:val="en-US"/>
-        </w:rPr>
-        <w:t>))</w:t>
-      </w:r>
-      <w:proofErr w:type="gramStart"/>
-      <w:r>
-        <w:rPr>
-          <w:rFonts w:ascii="Arial" w:hAnsi="Arial" w:cs="Arial"/>
-          <w:b/>
-          <w:szCs w:val="24"/>
-          <w:lang w:val="en-US"/>
-        </w:rPr>
-        <w:t>);</w:t>
-      </w:r>
-      <w:proofErr w:type="gramEnd"/>
+        <w:t>pos=find(ismember(modelSampling</w:t>
+      </w:r>
+      <w:r>
+        <w:rPr>
+          <w:rFonts w:ascii="Arial" w:hAnsi="Arial" w:cs="Arial"/>
+          <w:b/>
+          <w:szCs w:val="24"/>
+          <w:lang w:val="en-US"/>
+        </w:rPr>
+        <w:t>.rxns,rxns(i)));</w:t>
+      </w:r>
     </w:p>
     <w:p>
       <w:pPr>
@@ -4677,61 +4301,8 @@
           <w:szCs w:val="24"/>
           <w:lang w:val="en-US"/>
         </w:rPr>
-        <w:t>[</w:t>
-      </w:r>
-      <w:proofErr w:type="spellStart"/>
-      <w:proofErr w:type="gramStart"/>
-      <w:r>
-        <w:rPr>
-          <w:rFonts w:ascii="Arial" w:hAnsi="Arial" w:cs="Arial"/>
-          <w:b/>
-          <w:szCs w:val="24"/>
-          <w:lang w:val="en-US"/>
-        </w:rPr>
-        <w:t>counts,centers</w:t>
-      </w:r>
-      <w:proofErr w:type="spellEnd"/>
-      <w:proofErr w:type="gramEnd"/>
-      <w:r>
-        <w:rPr>
-          <w:rFonts w:ascii="Arial" w:hAnsi="Arial" w:cs="Arial"/>
-          <w:b/>
-          <w:szCs w:val="24"/>
-          <w:lang w:val="en-US"/>
-        </w:rPr>
-        <w:t>]=hist(samples(</w:t>
-      </w:r>
-      <w:proofErr w:type="gramStart"/>
-      <w:r>
-        <w:rPr>
-          <w:rFonts w:ascii="Arial" w:hAnsi="Arial" w:cs="Arial"/>
-          <w:b/>
-          <w:szCs w:val="24"/>
-          <w:lang w:val="en-US"/>
-        </w:rPr>
-        <w:t>pos,:)</w:t>
-      </w:r>
-      <w:proofErr w:type="gramEnd"/>
-      <w:r>
-        <w:rPr>
-          <w:rFonts w:ascii="Arial" w:hAnsi="Arial" w:cs="Arial"/>
-          <w:b/>
-          <w:szCs w:val="24"/>
-          <w:lang w:val="en-US"/>
-        </w:rPr>
-        <w:t>,15</w:t>
-      </w:r>
-      <w:proofErr w:type="gramStart"/>
-      <w:r>
-        <w:rPr>
-          <w:rFonts w:ascii="Arial" w:hAnsi="Arial" w:cs="Arial"/>
-          <w:b/>
-          <w:szCs w:val="24"/>
-          <w:lang w:val="en-US"/>
-        </w:rPr>
-        <w:t>);</w:t>
-      </w:r>
-      <w:proofErr w:type="gramEnd"/>
+        <w:t>[counts,centers]=hist(samples(pos,:),15);</w:t>
+      </w:r>
     </w:p>
     <w:p>
       <w:pPr>
@@ -4772,27 +4343,7 @@
           <w:szCs w:val="24"/>
           <w:lang w:val="en-US"/>
         </w:rPr>
-        <w:t>plot(</w:t>
-      </w:r>
-      <w:proofErr w:type="gramStart"/>
-      <w:r>
-        <w:rPr>
-          <w:rFonts w:ascii="Arial" w:hAnsi="Arial" w:cs="Arial"/>
-          <w:b/>
-          <w:szCs w:val="24"/>
-          <w:lang w:val="en-US"/>
-        </w:rPr>
-        <w:t>centers,counts</w:t>
-      </w:r>
-      <w:proofErr w:type="gramEnd"/>
-      <w:r>
-        <w:rPr>
-          <w:rFonts w:ascii="Arial" w:hAnsi="Arial" w:cs="Arial"/>
-          <w:b/>
-          <w:szCs w:val="24"/>
-          <w:lang w:val="en-US"/>
-        </w:rPr>
-        <w:t>,'k','LineWidth',2)</w:t>
+        <w:t>plot(centers,counts,'k','LineWidth',2)</w:t>
       </w:r>
     </w:p>
     <w:p>
@@ -4876,81 +4427,8 @@
           <w:szCs w:val="24"/>
           <w:lang w:val="en-US"/>
         </w:rPr>
-        <w:t>pos=find(</w:t>
-      </w:r>
-      <w:proofErr w:type="spellStart"/>
-      <w:r>
-        <w:rPr>
-          <w:rFonts w:ascii="Arial" w:hAnsi="Arial" w:cs="Arial"/>
-          <w:b/>
-          <w:szCs w:val="24"/>
-          <w:lang w:val="en-US"/>
-        </w:rPr>
-        <w:t>ismember</w:t>
-      </w:r>
-      <w:proofErr w:type="spellEnd"/>
-      <w:r>
-        <w:rPr>
-          <w:rFonts w:ascii="Arial" w:hAnsi="Arial" w:cs="Arial"/>
-          <w:b/>
-          <w:szCs w:val="24"/>
-          <w:lang w:val="en-US"/>
-        </w:rPr>
-        <w:t>(</w:t>
-      </w:r>
-      <w:proofErr w:type="spellStart"/>
-      <w:proofErr w:type="gramStart"/>
-      <w:r>
-        <w:rPr>
-          <w:rFonts w:ascii="Arial" w:hAnsi="Arial" w:cs="Arial"/>
-          <w:b/>
-          <w:szCs w:val="24"/>
-          <w:lang w:val="en-US"/>
-        </w:rPr>
-        <w:t>model.rxns</w:t>
-      </w:r>
-      <w:proofErr w:type="gramEnd"/>
-      <w:r>
-        <w:rPr>
-          <w:rFonts w:ascii="Arial" w:hAnsi="Arial" w:cs="Arial"/>
-          <w:b/>
-          <w:szCs w:val="24"/>
-          <w:lang w:val="en-US"/>
-        </w:rPr>
-        <w:t>,rxns</w:t>
-      </w:r>
-      <w:proofErr w:type="spellEnd"/>
-      <w:r>
-        <w:rPr>
-          <w:rFonts w:ascii="Arial" w:hAnsi="Arial" w:cs="Arial"/>
-          <w:b/>
-          <w:szCs w:val="24"/>
-          <w:lang w:val="en-US"/>
-        </w:rPr>
-        <w:t>(</w:t>
-      </w:r>
-      <w:proofErr w:type="spellStart"/>
-      <w:proofErr w:type="gramStart"/>
-      <w:r>
-        <w:rPr>
-          <w:rFonts w:ascii="Arial" w:hAnsi="Arial" w:cs="Arial"/>
-          <w:b/>
-          <w:szCs w:val="24"/>
-          <w:lang w:val="en-US"/>
-        </w:rPr>
-        <w:t>i</w:t>
-      </w:r>
-      <w:proofErr w:type="spellEnd"/>
-      <w:r>
-        <w:rPr>
-          <w:rFonts w:ascii="Arial" w:hAnsi="Arial" w:cs="Arial"/>
-          <w:b/>
-          <w:szCs w:val="24"/>
-          <w:lang w:val="en-US"/>
-        </w:rPr>
-        <w:t>)));</w:t>
-      </w:r>
-      <w:proofErr w:type="gramEnd"/>
+        <w:t>pos=find(ismember(model.rxns,rxns(i)));</w:t>
+      </w:r>
     </w:p>
     <w:p>
       <w:pPr>
@@ -4984,48 +4462,15 @@
         </w:rPr>
         <w:tab/>
       </w:r>
-      <w:proofErr w:type="spellStart"/>
-      <w:r>
-        <w:rPr>
-          <w:rFonts w:ascii="Arial" w:hAnsi="Arial" w:cs="Arial"/>
-          <w:b/>
-          <w:szCs w:val="24"/>
-          <w:lang w:val="en-US"/>
-        </w:rPr>
-        <w:t>fig_axis</w:t>
-      </w:r>
-      <w:proofErr w:type="spellEnd"/>
-      <w:r>
-        <w:rPr>
-          <w:rFonts w:ascii="Arial" w:hAnsi="Arial" w:cs="Arial"/>
-          <w:b/>
-          <w:szCs w:val="24"/>
-          <w:lang w:val="en-US"/>
-        </w:rPr>
-        <w:t>=get(</w:t>
-      </w:r>
-      <w:proofErr w:type="spellStart"/>
-      <w:r>
-        <w:rPr>
-          <w:rFonts w:ascii="Arial" w:hAnsi="Arial" w:cs="Arial"/>
-          <w:b/>
-          <w:szCs w:val="24"/>
-          <w:lang w:val="en-US"/>
-        </w:rPr>
-        <w:t>gca</w:t>
-      </w:r>
-      <w:proofErr w:type="spellEnd"/>
-      <w:proofErr w:type="gramStart"/>
-      <w:r>
-        <w:rPr>
-          <w:rFonts w:ascii="Arial" w:hAnsi="Arial" w:cs="Arial"/>
-          <w:b/>
-          <w:szCs w:val="24"/>
-          <w:lang w:val="en-US"/>
-        </w:rPr>
-        <w:t>);</w:t>
-      </w:r>
-      <w:proofErr w:type="gramEnd"/>
+      <w:r>
+        <w:rPr>
+          <w:rFonts w:ascii="Arial" w:hAnsi="Arial" w:cs="Arial"/>
+          <w:b/>
+          <w:szCs w:val="24"/>
+          <w:lang w:val="en-US"/>
+        </w:rPr>
+        <w:t>fig_axis=get(gca);</w:t>
+      </w:r>
     </w:p>
     <w:p>
       <w:pPr>
@@ -5059,68 +4504,15 @@
         </w:rPr>
         <w:tab/>
       </w:r>
-      <w:proofErr w:type="spellStart"/>
-      <w:r>
-        <w:rPr>
-          <w:rFonts w:ascii="Arial" w:hAnsi="Arial" w:cs="Arial"/>
-          <w:b/>
-          <w:szCs w:val="24"/>
-          <w:lang w:val="en-US"/>
-        </w:rPr>
-        <w:t>max_y</w:t>
-      </w:r>
-      <w:proofErr w:type="spellEnd"/>
-      <w:r>
-        <w:rPr>
-          <w:rFonts w:ascii="Arial" w:hAnsi="Arial" w:cs="Arial"/>
-          <w:b/>
-          <w:szCs w:val="24"/>
-          <w:lang w:val="en-US"/>
-        </w:rPr>
-        <w:t>=</w:t>
-      </w:r>
-      <w:proofErr w:type="spellStart"/>
-      <w:r>
-        <w:rPr>
-          <w:rFonts w:ascii="Arial" w:hAnsi="Arial" w:cs="Arial"/>
-          <w:b/>
-          <w:szCs w:val="24"/>
-          <w:lang w:val="en-US"/>
-        </w:rPr>
-        <w:t>fig_</w:t>
-      </w:r>
-      <w:proofErr w:type="gramStart"/>
-      <w:r>
-        <w:rPr>
-          <w:rFonts w:ascii="Arial" w:hAnsi="Arial" w:cs="Arial"/>
-          <w:b/>
-          <w:szCs w:val="24"/>
-          <w:lang w:val="en-US"/>
-        </w:rPr>
-        <w:t>axis.YLim</w:t>
-      </w:r>
-      <w:proofErr w:type="spellEnd"/>
-      <w:proofErr w:type="gramEnd"/>
-      <w:r>
-        <w:rPr>
-          <w:rFonts w:ascii="Arial" w:hAnsi="Arial" w:cs="Arial"/>
-          <w:b/>
-          <w:szCs w:val="24"/>
-          <w:lang w:val="en-US"/>
-        </w:rPr>
-        <w:t>(2</w:t>
-      </w:r>
-      <w:proofErr w:type="gramStart"/>
-      <w:r>
-        <w:rPr>
-          <w:rFonts w:ascii="Arial" w:hAnsi="Arial" w:cs="Arial"/>
-          <w:b/>
-          <w:szCs w:val="24"/>
-          <w:lang w:val="en-US"/>
-        </w:rPr>
-        <w:t>);</w:t>
-      </w:r>
-      <w:proofErr w:type="gramEnd"/>
+      <w:r>
+        <w:rPr>
+          <w:rFonts w:ascii="Arial" w:hAnsi="Arial" w:cs="Arial"/>
+          <w:b/>
+          <w:szCs w:val="24"/>
+          <w:lang w:val="en-US"/>
+        </w:rPr>
+        <w:t>max_y=fig_axis.YLim(2);</w:t>
+      </w:r>
     </w:p>
     <w:p>
       <w:pPr>
@@ -5133,7 +4525,7 @@
           <w:rFonts w:ascii="Arial" w:hAnsi="Arial" w:cs="Arial"/>
           <w:b/>
           <w:szCs w:val="24"/>
-          <w:lang w:val="en-US"/>
+          <w:lang w:val="fr-FR"/>
         </w:rPr>
       </w:pPr>
       <w:r>
@@ -5154,88 +4546,24 @@
         </w:rPr>
         <w:tab/>
       </w:r>
-      <w:proofErr w:type="gramStart"/>
-      <w:r>
-        <w:rPr>
-          <w:rFonts w:ascii="Arial" w:hAnsi="Arial" w:cs="Arial"/>
-          <w:b/>
-          <w:szCs w:val="24"/>
-          <w:lang w:val="en-US"/>
-        </w:rPr>
-        <w:t>plot([</w:t>
-      </w:r>
-      <w:proofErr w:type="spellStart"/>
-      <w:proofErr w:type="gramEnd"/>
-      <w:r>
-        <w:rPr>
-          <w:rFonts w:ascii="Arial" w:hAnsi="Arial" w:cs="Arial"/>
-          <w:b/>
-          <w:szCs w:val="24"/>
-          <w:lang w:val="en-US"/>
-        </w:rPr>
-        <w:t>minFlux</w:t>
-      </w:r>
-      <w:proofErr w:type="spellEnd"/>
-      <w:r>
-        <w:rPr>
-          <w:rFonts w:ascii="Arial" w:hAnsi="Arial" w:cs="Arial"/>
-          <w:b/>
-          <w:szCs w:val="24"/>
-          <w:lang w:val="en-US"/>
-        </w:rPr>
-        <w:t xml:space="preserve">(pos) </w:t>
-      </w:r>
-      <w:proofErr w:type="spellStart"/>
-      <w:r>
-        <w:rPr>
-          <w:rFonts w:ascii="Arial" w:hAnsi="Arial" w:cs="Arial"/>
-          <w:b/>
-          <w:szCs w:val="24"/>
-          <w:lang w:val="en-US"/>
-        </w:rPr>
-        <w:t>minFlux</w:t>
-      </w:r>
-      <w:proofErr w:type="spellEnd"/>
-      <w:r>
-        <w:rPr>
-          <w:rFonts w:ascii="Arial" w:hAnsi="Arial" w:cs="Arial"/>
-          <w:b/>
-          <w:szCs w:val="24"/>
-          <w:lang w:val="en-US"/>
-        </w:rPr>
-        <w:t xml:space="preserve">(pos)], [0 </w:t>
-      </w:r>
-      <w:proofErr w:type="spellStart"/>
-      <w:r>
-        <w:rPr>
-          <w:rFonts w:ascii="Arial" w:hAnsi="Arial" w:cs="Arial"/>
-          <w:b/>
-          <w:szCs w:val="24"/>
-          <w:lang w:val="en-US"/>
-        </w:rPr>
-        <w:t>max_y</w:t>
-      </w:r>
-      <w:proofErr w:type="spellEnd"/>
-      <w:r>
-        <w:rPr>
-          <w:rFonts w:ascii="Arial" w:hAnsi="Arial" w:cs="Arial"/>
-          <w:b/>
-          <w:szCs w:val="24"/>
-          <w:lang w:val="en-US"/>
-        </w:rPr>
-        <w:t>],'r','LineWidth',2</w:t>
-      </w:r>
-      <w:proofErr w:type="gramStart"/>
-      <w:r>
-        <w:rPr>
-          <w:rFonts w:ascii="Arial" w:hAnsi="Arial" w:cs="Arial"/>
-          <w:b/>
-          <w:szCs w:val="24"/>
-          <w:lang w:val="en-US"/>
-        </w:rPr>
-        <w:t>);</w:t>
-      </w:r>
-      <w:proofErr w:type="gramEnd"/>
+      <w:r>
+        <w:rPr>
+          <w:rFonts w:ascii="Arial" w:hAnsi="Arial" w:cs="Arial"/>
+          <w:b/>
+          <w:szCs w:val="24"/>
+          <w:lang w:val="fr-FR"/>
+        </w:rPr>
+        <w:t>plot([minFlux</w:t>
+      </w:r>
+      <w:r>
+        <w:rPr>
+          <w:rFonts w:ascii="Arial" w:hAnsi="Arial" w:cs="Arial"/>
+          <w:b/>
+          <w:szCs w:val="24"/>
+          <w:lang w:val="fr-FR"/>
+        </w:rPr>
+        <w:t>(pos) minFlux(pos)], [0 max_y],'r','LineWidth',2);</w:t>
+      </w:r>
     </w:p>
     <w:p>
       <w:pPr>
@@ -5255,7 +4583,7 @@
           <w:rFonts w:ascii="Arial" w:hAnsi="Arial" w:cs="Arial"/>
           <w:b/>
           <w:szCs w:val="24"/>
-          <w:lang w:val="en-US"/>
+          <w:lang w:val="fr-FR"/>
         </w:rPr>
         <w:t xml:space="preserve"> </w:t>
       </w:r>
@@ -5264,92 +4592,18 @@
           <w:rFonts w:ascii="Arial" w:hAnsi="Arial" w:cs="Arial"/>
           <w:b/>
           <w:szCs w:val="24"/>
-          <w:lang w:val="en-US"/>
+          <w:lang w:val="fr-FR"/>
         </w:rPr>
         <w:tab/>
       </w:r>
-      <w:proofErr w:type="gramStart"/>
-      <w:r>
-        <w:rPr>
-          <w:rFonts w:ascii="Arial" w:hAnsi="Arial" w:cs="Arial"/>
-          <w:b/>
-          <w:szCs w:val="24"/>
-        </w:rPr>
-        <w:t>plot</w:t>
-      </w:r>
-      <w:proofErr w:type="gramEnd"/>
-      <w:r>
-        <w:rPr>
-          <w:rFonts w:ascii="Arial" w:hAnsi="Arial" w:cs="Arial"/>
-          <w:b/>
-          <w:szCs w:val="24"/>
-        </w:rPr>
-        <w:t>([</w:t>
-      </w:r>
-      <w:proofErr w:type="spellStart"/>
-      <w:r>
-        <w:rPr>
-          <w:rFonts w:ascii="Arial" w:hAnsi="Arial" w:cs="Arial"/>
-          <w:b/>
-          <w:szCs w:val="24"/>
-        </w:rPr>
-        <w:t>maxFlux</w:t>
-      </w:r>
-      <w:proofErr w:type="spellEnd"/>
-      <w:r>
-        <w:rPr>
-          <w:rFonts w:ascii="Arial" w:hAnsi="Arial" w:cs="Arial"/>
-          <w:b/>
-          <w:szCs w:val="24"/>
-        </w:rPr>
-        <w:t xml:space="preserve">(pos) </w:t>
-      </w:r>
-      <w:proofErr w:type="spellStart"/>
-      <w:r>
-        <w:rPr>
-          <w:rFonts w:ascii="Arial" w:hAnsi="Arial" w:cs="Arial"/>
-          <w:b/>
-          <w:szCs w:val="24"/>
-        </w:rPr>
-        <w:t>maxFlux</w:t>
-      </w:r>
-      <w:proofErr w:type="spellEnd"/>
-      <w:r>
-        <w:rPr>
-          <w:rFonts w:ascii="Arial" w:hAnsi="Arial" w:cs="Arial"/>
-          <w:b/>
-          <w:szCs w:val="24"/>
-        </w:rPr>
-        <w:t xml:space="preserve">(pos)], [0 </w:t>
-      </w:r>
-      <w:proofErr w:type="spellStart"/>
-      <w:r>
-        <w:rPr>
-          <w:rFonts w:ascii="Arial" w:hAnsi="Arial" w:cs="Arial"/>
-          <w:b/>
-          <w:szCs w:val="24"/>
-        </w:rPr>
-        <w:t>max_y</w:t>
-      </w:r>
-      <w:proofErr w:type="spellEnd"/>
-      <w:r>
-        <w:rPr>
-          <w:rFonts w:ascii="Arial" w:hAnsi="Arial" w:cs="Arial"/>
-          <w:b/>
-          <w:szCs w:val="24"/>
-        </w:rPr>
-        <w:t>],'r','LineWidth',2</w:t>
-      </w:r>
-      <w:proofErr w:type="gramStart"/>
-      <w:r>
-        <w:rPr>
-          <w:rFonts w:ascii="Arial" w:hAnsi="Arial" w:cs="Arial"/>
-          <w:b/>
-          <w:szCs w:val="24"/>
-        </w:rPr>
-        <w:t>);</w:t>
-      </w:r>
-      <w:proofErr w:type="gramEnd"/>
+      <w:r>
+        <w:rPr>
+          <w:rFonts w:ascii="Arial" w:hAnsi="Arial" w:cs="Arial"/>
+          <w:b/>
+          <w:szCs w:val="24"/>
+        </w:rPr>
+        <w:t>plot([maxFlux(pos) maxFlux(pos)], [0 max_y],'r','LineWidth',2);</w:t>
+      </w:r>
     </w:p>
     <w:p>
       <w:pPr>
@@ -5380,88 +4634,14 @@
         </w:rPr>
         <w:tab/>
       </w:r>
-      <w:proofErr w:type="gramStart"/>
-      <w:r>
-        <w:rPr>
-          <w:rFonts w:ascii="Arial" w:hAnsi="Arial" w:cs="Arial"/>
-          <w:b/>
-          <w:szCs w:val="24"/>
-        </w:rPr>
-        <w:t>plot</w:t>
-      </w:r>
-      <w:proofErr w:type="gramEnd"/>
-      <w:r>
-        <w:rPr>
-          <w:rFonts w:ascii="Arial" w:hAnsi="Arial" w:cs="Arial"/>
-          <w:b/>
-          <w:szCs w:val="24"/>
-        </w:rPr>
-        <w:t>([</w:t>
-      </w:r>
-      <w:proofErr w:type="spellStart"/>
-      <w:r>
-        <w:rPr>
-          <w:rFonts w:ascii="Arial" w:hAnsi="Arial" w:cs="Arial"/>
-          <w:b/>
-          <w:szCs w:val="24"/>
-        </w:rPr>
-        <w:t>FBAsolution.x</w:t>
-      </w:r>
-      <w:proofErr w:type="spellEnd"/>
-      <w:r>
-        <w:rPr>
-          <w:rFonts w:ascii="Arial" w:hAnsi="Arial" w:cs="Arial"/>
-          <w:b/>
-          <w:szCs w:val="24"/>
-        </w:rPr>
-        <w:t xml:space="preserve">(pos) </w:t>
-      </w:r>
-      <w:proofErr w:type="spellStart"/>
-      <w:r>
-        <w:rPr>
-          <w:rFonts w:ascii="Arial" w:hAnsi="Arial" w:cs="Arial"/>
-          <w:b/>
-          <w:szCs w:val="24"/>
-        </w:rPr>
-        <w:t>FBAsolution.x</w:t>
-      </w:r>
-      <w:proofErr w:type="spellEnd"/>
-      <w:r>
-        <w:rPr>
-          <w:rFonts w:ascii="Arial" w:hAnsi="Arial" w:cs="Arial"/>
-          <w:b/>
-          <w:szCs w:val="24"/>
-        </w:rPr>
-        <w:t xml:space="preserve">(pos)], [0 </w:t>
-      </w:r>
-      <w:proofErr w:type="spellStart"/>
-      <w:r>
-        <w:rPr>
-          <w:rFonts w:ascii="Arial" w:hAnsi="Arial" w:cs="Arial"/>
-          <w:b/>
-          <w:szCs w:val="24"/>
-        </w:rPr>
-        <w:t>max_y</w:t>
-      </w:r>
-      <w:proofErr w:type="spellEnd"/>
-      <w:r>
-        <w:rPr>
-          <w:rFonts w:ascii="Arial" w:hAnsi="Arial" w:cs="Arial"/>
-          <w:b/>
-          <w:szCs w:val="24"/>
-        </w:rPr>
-        <w:t>],'y*','LineWidth',2</w:t>
-      </w:r>
-      <w:proofErr w:type="gramStart"/>
-      <w:r>
-        <w:rPr>
-          <w:rFonts w:ascii="Arial" w:hAnsi="Arial" w:cs="Arial"/>
-          <w:b/>
-          <w:szCs w:val="24"/>
-        </w:rPr>
-        <w:t>);</w:t>
-      </w:r>
-      <w:proofErr w:type="gramEnd"/>
+      <w:r>
+        <w:rPr>
+          <w:rFonts w:ascii="Arial" w:hAnsi="Arial" w:cs="Arial"/>
+          <w:b/>
+          <w:szCs w:val="24"/>
+        </w:rPr>
+        <w:t>plot([FBAsolution.x(pos) FBAsolution.x(pos)], [0 max_y],'y*','LineWidth',2);</w:t>
+      </w:r>
     </w:p>
     <w:p>
       <w:pPr>
@@ -5500,41 +4680,8 @@
           <w:szCs w:val="24"/>
           <w:lang w:val="en-US"/>
         </w:rPr>
-        <w:t>title(</w:t>
-      </w:r>
-      <w:proofErr w:type="spellStart"/>
-      <w:proofErr w:type="gramStart"/>
-      <w:r>
-        <w:rPr>
-          <w:rFonts w:ascii="Arial" w:hAnsi="Arial" w:cs="Arial"/>
-          <w:b/>
-          <w:szCs w:val="24"/>
-          <w:lang w:val="en-US"/>
-        </w:rPr>
-        <w:t>model.rxns</w:t>
-      </w:r>
-      <w:proofErr w:type="spellEnd"/>
-      <w:proofErr w:type="gramEnd"/>
-      <w:r>
-        <w:rPr>
-          <w:rFonts w:ascii="Arial" w:hAnsi="Arial" w:cs="Arial"/>
-          <w:b/>
-          <w:szCs w:val="24"/>
-          <w:lang w:val="en-US"/>
-        </w:rPr>
-        <w:t>{pos}</w:t>
-      </w:r>
-      <w:proofErr w:type="gramStart"/>
-      <w:r>
-        <w:rPr>
-          <w:rFonts w:ascii="Arial" w:hAnsi="Arial" w:cs="Arial"/>
-          <w:b/>
-          <w:szCs w:val="24"/>
-          <w:lang w:val="en-US"/>
-        </w:rPr>
-        <w:t>);</w:t>
-      </w:r>
-      <w:proofErr w:type="gramEnd"/>
+        <w:t>title(model.rxns{pos});</w:t>
+      </w:r>
     </w:p>
     <w:p>
       <w:pPr>
@@ -5568,25 +4715,14 @@
         </w:rPr>
         <w:tab/>
       </w:r>
-      <w:proofErr w:type="spellStart"/>
-      <w:r>
-        <w:rPr>
-          <w:rFonts w:ascii="Arial" w:hAnsi="Arial" w:cs="Arial"/>
-          <w:b/>
-          <w:szCs w:val="24"/>
-          <w:lang w:val="en-US"/>
-        </w:rPr>
-        <w:t>xlabel</w:t>
-      </w:r>
-      <w:proofErr w:type="spellEnd"/>
-      <w:r>
-        <w:rPr>
-          <w:rFonts w:ascii="Arial" w:hAnsi="Arial" w:cs="Arial"/>
-          <w:b/>
-          <w:szCs w:val="24"/>
-          <w:lang w:val="en-US"/>
-        </w:rPr>
-        <w:t>('Flux')</w:t>
+      <w:r>
+        <w:rPr>
+          <w:rFonts w:ascii="Arial" w:hAnsi="Arial" w:cs="Arial"/>
+          <w:b/>
+          <w:szCs w:val="24"/>
+          <w:lang w:val="en-US"/>
+        </w:rPr>
+        <w:t>xlabel('Flux')</w:t>
       </w:r>
     </w:p>
     <w:p>
@@ -5621,36 +4757,14 @@
         </w:rPr>
         <w:tab/>
       </w:r>
-      <w:proofErr w:type="spellStart"/>
-      <w:proofErr w:type="gramStart"/>
-      <w:r>
-        <w:rPr>
-          <w:rFonts w:ascii="Arial" w:hAnsi="Arial" w:cs="Arial"/>
-          <w:b/>
-          <w:szCs w:val="24"/>
-          <w:lang w:val="en-US"/>
-        </w:rPr>
-        <w:t>ylabel</w:t>
-      </w:r>
-      <w:proofErr w:type="spellEnd"/>
-      <w:r>
-        <w:rPr>
-          <w:rFonts w:ascii="Arial" w:hAnsi="Arial" w:cs="Arial"/>
-          <w:b/>
-          <w:szCs w:val="24"/>
-          <w:lang w:val="en-US"/>
-        </w:rPr>
-        <w:t>(</w:t>
-      </w:r>
-      <w:proofErr w:type="gramEnd"/>
-      <w:r>
-        <w:rPr>
-          <w:rFonts w:ascii="Arial" w:hAnsi="Arial" w:cs="Arial"/>
-          <w:b/>
-          <w:szCs w:val="24"/>
-          <w:lang w:val="en-US"/>
-        </w:rPr>
-        <w:t>'# samples')</w:t>
+      <w:r>
+        <w:rPr>
+          <w:rFonts w:ascii="Arial" w:hAnsi="Arial" w:cs="Arial"/>
+          <w:b/>
+          <w:szCs w:val="24"/>
+          <w:lang w:val="en-US"/>
+        </w:rPr>
+        <w:t>ylabel('# samples')</w:t>
       </w:r>
     </w:p>
     <w:p>
@@ -5712,62 +4826,22 @@
           <w:rFonts w:ascii="Arial" w:hAnsi="Arial" w:cs="Arial"/>
           <w:b/>
           <w:szCs w:val="24"/>
-          <w:lang w:val="en-US"/>
-        </w:rPr>
-      </w:pPr>
-      <w:r>
-        <w:rPr>
-          <w:rFonts w:ascii="Arial" w:hAnsi="Arial" w:cs="Arial"/>
-          <w:b/>
-          <w:szCs w:val="24"/>
-          <w:lang w:val="en-US"/>
-        </w:rPr>
-        <w:t>legend('Sampling','</w:t>
-      </w:r>
-      <w:proofErr w:type="spellStart"/>
-      <w:r>
-        <w:rPr>
-          <w:rFonts w:ascii="Arial" w:hAnsi="Arial" w:cs="Arial"/>
-          <w:b/>
-          <w:szCs w:val="24"/>
-          <w:lang w:val="en-US"/>
-        </w:rPr>
-        <w:t>MinFVA</w:t>
-      </w:r>
-      <w:proofErr w:type="spellEnd"/>
-      <w:r>
-        <w:rPr>
-          <w:rFonts w:ascii="Arial" w:hAnsi="Arial" w:cs="Arial"/>
-          <w:b/>
-          <w:szCs w:val="24"/>
-          <w:lang w:val="en-US"/>
-        </w:rPr>
-        <w:t>','</w:t>
-      </w:r>
-      <w:proofErr w:type="spellStart"/>
-      <w:r>
-        <w:rPr>
-          <w:rFonts w:ascii="Arial" w:hAnsi="Arial" w:cs="Arial"/>
-          <w:b/>
-          <w:szCs w:val="24"/>
-          <w:lang w:val="en-US"/>
-        </w:rPr>
-        <w:t>MaxFVA</w:t>
-      </w:r>
-      <w:proofErr w:type="spellEnd"/>
-      <w:r>
-        <w:rPr>
-          <w:rFonts w:ascii="Arial" w:hAnsi="Arial" w:cs="Arial"/>
-          <w:b/>
-          <w:szCs w:val="24"/>
-          <w:lang w:val="en-US"/>
-        </w:rPr>
-        <w:t>','FBA')</w:t>
+          <w:lang w:val="nl-NL"/>
+        </w:rPr>
+      </w:pPr>
+      <w:r>
+        <w:rPr>
+          <w:rFonts w:ascii="Arial" w:hAnsi="Arial" w:cs="Arial"/>
+          <w:b/>
+          <w:szCs w:val="24"/>
+          <w:lang w:val="nl-NL"/>
+        </w:rPr>
+        <w:t>legend('Sampling','MinFVA','MaxFVA','FBA')</w:t>
       </w:r>
     </w:p>
     <w:p>
       <w:pPr>
-        <w:pStyle w:val="ListParagraph"/>
+        <w:pStyle w:val="Paragraphedeliste"/>
         <w:numPr>
           <w:ilvl w:val="0"/>
           <w:numId w:val="5"/>
@@ -5837,7 +4911,7 @@
     </w:p>
     <w:p>
       <w:pPr>
-        <w:pStyle w:val="ListParagraph"/>
+        <w:pStyle w:val="Paragraphedeliste"/>
         <w:numPr>
           <w:ilvl w:val="0"/>
           <w:numId w:val="5"/>
@@ -7306,13 +6380,13 @@
     <w:qFormat/>
     <w:rsid w:val="007A760A"/>
   </w:style>
-  <w:style w:type="character" w:default="1" w:styleId="DefaultParagraphFont">
+  <w:style w:type="character" w:default="1" w:styleId="Policepardfaut">
     <w:name w:val="Default Paragraph Font"/>
     <w:uiPriority w:val="1"/>
     <w:semiHidden/>
     <w:unhideWhenUsed/>
   </w:style>
-  <w:style w:type="table" w:default="1" w:styleId="TableNormal">
+  <w:style w:type="table" w:default="1" w:styleId="TableauNormal">
     <w:name w:val="Normal Table"/>
     <w:uiPriority w:val="99"/>
     <w:semiHidden/>
@@ -7327,13 +6401,13 @@
       </w:tblCellMar>
     </w:tblPr>
   </w:style>
-  <w:style w:type="numbering" w:default="1" w:styleId="NoList">
+  <w:style w:type="numbering" w:default="1" w:styleId="Aucuneliste">
     <w:name w:val="No List"/>
     <w:uiPriority w:val="99"/>
     <w:semiHidden/>
     <w:unhideWhenUsed/>
   </w:style>
-  <w:style w:type="paragraph" w:styleId="ListParagraph">
+  <w:style w:type="paragraph" w:styleId="Paragraphedeliste">
     <w:name w:val="List Paragraph"/>
     <w:basedOn w:val="Normal"/>
     <w:uiPriority w:val="34"/>
@@ -7344,9 +6418,9 @@
       <w:contextualSpacing/>
     </w:pPr>
   </w:style>
-  <w:style w:type="table" w:styleId="TableGrid">
+  <w:style w:type="table" w:styleId="Grilledutableau">
     <w:name w:val="Table Grid"/>
-    <w:basedOn w:val="TableNormal"/>
+    <w:basedOn w:val="TableauNormal"/>
     <w:uiPriority w:val="39"/>
     <w:rsid w:val="005F48DE"/>
     <w:pPr>

</xml_diff>